<commit_message>
Normalizar extension .pdf en calles y reindexar
</commit_message>
<xml_diff>
--- a/calles/Mis apuntes/Diapositivas.docx
+++ b/calles/Mis apuntes/Diapositivas.docx
@@ -32,7 +32,6 @@
         <w:rPr>
           <w:rtl w:val="0"/>
         </w:rPr>
-        <w:t xml:space="preserve">Vicente montuno</w:t>
       </w:r>
     </w:p>
     <w:p>
@@ -88,38 +87,6 @@
           <w:rtl w:val="0"/>
         </w:rPr>
         <w:t xml:space="preserve">Cambil</w:t>
-      </w:r>
-    </w:p>
-    <w:p>
-      <w:pPr>
-        <w:rPr/>
-      </w:pPr>
-      <w:r>
-        <w:rPr>
-          <w:rtl w:val="0"/>
-        </w:rPr>
-        <w:t xml:space="preserve">Torre del homenaje</w:t>
-      </w:r>
-    </w:p>
-    <w:p>
-      <w:pPr>
-        <w:rPr/>
-      </w:pPr>
-      <w:r>
-        <w:rPr>
-          <w:rtl w:val="0"/>
-        </w:rPr>
-        <w:t xml:space="preserve">Los torres</w:t>
-      </w:r>
-    </w:p>
-    <w:p>
-      <w:pPr>
-        <w:rPr/>
-      </w:pPr>
-      <w:r>
-        <w:rPr>
-          <w:rtl w:val="0"/>
-        </w:rPr>
       </w:r>
     </w:p>
     <w:sectPr>

</xml_diff>